<commit_message>
docs: improve TIF index
</commit_message>
<xml_diff>
--- a/Trabajo_Integracion_Final_Mutual_de_Todos.docx
+++ b/Trabajo_Integracion_Final_Mutual_de_Todos.docx
@@ -4,7 +4,6 @@
   <w:body>
     <w:p>
       <w:pPr>
-        <w:spacing w:line="276" w:lineRule="auto" w:after="160"/>
         <w:jc w:val="center"/>
       </w:pPr>
       <w:r>
@@ -20,9 +19,7 @@
       </w:pPr>
     </w:p>
     <w:p>
-      <w:pPr>
-        <w:spacing w:line="276" w:lineRule="auto" w:after="160"/>
-      </w:pPr>
+      <w:pPr/>
       <w:r>
         <w:rPr>
           <w:b/>
@@ -36,9 +33,7 @@
       </w:pPr>
     </w:p>
     <w:p>
-      <w:pPr>
-        <w:spacing w:line="276" w:lineRule="auto" w:after="160"/>
-      </w:pPr>
+      <w:pPr/>
       <w:r>
         <w:rPr>
           <w:b/>
@@ -52,9 +47,7 @@
       </w:pPr>
     </w:p>
     <w:p>
-      <w:pPr>
-        <w:spacing w:line="276" w:lineRule="auto" w:after="160"/>
-      </w:pPr>
+      <w:pPr/>
       <w:r>
         <w:rPr>
           <w:b/>
@@ -68,9 +61,7 @@
       </w:pPr>
     </w:p>
     <w:p>
-      <w:pPr>
-        <w:spacing w:line="276" w:lineRule="auto" w:after="160"/>
-      </w:pPr>
+      <w:pPr/>
       <w:r>
         <w:rPr>
           <w:b/>
@@ -84,9 +75,7 @@
       </w:pPr>
     </w:p>
     <w:p>
-      <w:pPr>
-        <w:spacing w:line="276" w:lineRule="auto" w:after="160"/>
-      </w:pPr>
+      <w:pPr/>
       <w:r>
         <w:rPr>
           <w:b/>
@@ -100,9 +89,7 @@
       </w:pPr>
     </w:p>
     <w:p>
-      <w:pPr>
-        <w:spacing w:line="276" w:lineRule="auto" w:after="160"/>
-      </w:pPr>
+      <w:pPr/>
       <w:r>
         <w:rPr>
           <w:b/>
@@ -116,9 +103,7 @@
       </w:pPr>
     </w:p>
     <w:p>
-      <w:pPr>
-        <w:spacing w:line="276" w:lineRule="auto" w:after="160"/>
-      </w:pPr>
+      <w:pPr/>
       <w:r>
         <w:rPr>
           <w:b/>
@@ -132,9 +117,7 @@
       </w:pPr>
     </w:p>
     <w:p>
-      <w:pPr>
-        <w:spacing w:line="276" w:lineRule="auto" w:after="160"/>
-      </w:pPr>
+      <w:pPr/>
       <w:r>
         <w:rPr>
           <w:b/>
@@ -148,9 +131,7 @@
       </w:pPr>
     </w:p>
     <w:p>
-      <w:pPr>
-        <w:spacing w:line="276" w:lineRule="auto" w:after="160"/>
-      </w:pPr>
+      <w:pPr/>
       <w:r>
         <w:rPr>
           <w:b/>
@@ -164,9 +145,7 @@
       </w:pPr>
     </w:p>
     <w:p>
-      <w:pPr>
-        <w:spacing w:line="276" w:lineRule="auto" w:after="160"/>
-      </w:pPr>
+      <w:pPr/>
       <w:r>
         <w:rPr>
           <w:b/>
@@ -180,9 +159,7 @@
       </w:pPr>
     </w:p>
     <w:p>
-      <w:pPr>
-        <w:spacing w:line="276" w:lineRule="auto" w:after="160"/>
-      </w:pPr>
+      <w:pPr/>
       <w:r>
         <w:rPr>
           <w:b/>
@@ -196,9 +173,7 @@
       </w:pPr>
     </w:p>
     <w:p>
-      <w:pPr>
-        <w:spacing w:line="276" w:lineRule="auto" w:after="160"/>
-      </w:pPr>
+      <w:pPr/>
       <w:r>
         <w:rPr>
           <w:b/>
@@ -212,9 +187,7 @@
       </w:pPr>
     </w:p>
     <w:p>
-      <w:pPr>
-        <w:spacing w:line="276" w:lineRule="auto" w:after="160"/>
-      </w:pPr>
+      <w:pPr/>
       <w:r>
         <w:rPr>
           <w:b/>
@@ -228,9 +201,7 @@
       </w:pPr>
     </w:p>
     <w:p>
-      <w:pPr>
-        <w:spacing w:line="276" w:lineRule="auto" w:after="160"/>
-      </w:pPr>
+      <w:pPr/>
       <w:r>
         <w:rPr>
           <w:b/>
@@ -250,12 +221,8 @@
     </w:p>
     <w:p>
       <w:pPr>
-        <w:spacing w:after="0" w:line="240" w:lineRule="auto"/>
-      </w:pPr>
-    </w:p>
-    <w:p>
-      <w:pPr>
-        <w:spacing w:line="276" w:lineRule="auto" w:after="160"/>
+        <w:pStyle w:val="Heading1"/>
+        <w:jc w:val="left"/>
       </w:pPr>
       <w:r>
         <w:rPr>
@@ -266,438 +233,611 @@
     </w:p>
     <w:p>
       <w:pPr>
+        <w:tabs>
+          <w:tab w:pos="8391" w:val="right" w:leader="dot"/>
+        </w:tabs>
+        <w:spacing w:after="40" w:line="240" w:lineRule="auto"/>
+        <w:jc w:val="left"/>
+      </w:pPr>
+      <w:r>
+        <w:t>Introducción al Proyecto</w:t>
+      </w:r>
+      <w:r>
+        <w:tab/>
+      </w:r>
+      <w:r>
+        <w:t>Pág. 3</w:t>
+      </w:r>
+    </w:p>
+    <w:p>
+      <w:pPr>
+        <w:tabs>
+          <w:tab w:pos="8391" w:val="right" w:leader="dot"/>
+        </w:tabs>
+        <w:spacing w:after="40" w:line="240" w:lineRule="auto"/>
+        <w:jc w:val="left"/>
+      </w:pPr>
+      <w:r>
+        <w:t>1. Contexto internacional</w:t>
+      </w:r>
+      <w:r>
+        <w:tab/>
+      </w:r>
+      <w:r>
+        <w:t>Pág. 4</w:t>
+      </w:r>
+    </w:p>
+    <w:p>
+      <w:pPr>
+        <w:tabs>
+          <w:tab w:pos="8391" w:val="right" w:leader="dot"/>
+        </w:tabs>
+        <w:spacing w:after="40" w:line="240" w:lineRule="auto"/>
+        <w:jc w:val="left"/>
+      </w:pPr>
+      <w:r>
+        <w:t>1.1 Conceptos teóricos más relevantes identificados</w:t>
+      </w:r>
+      <w:r>
+        <w:tab/>
+      </w:r>
+      <w:r>
+        <w:t>Pág. 4</w:t>
+      </w:r>
+    </w:p>
+    <w:p>
+      <w:pPr>
+        <w:tabs>
+          <w:tab w:pos="8391" w:val="right" w:leader="dot"/>
+        </w:tabs>
+        <w:spacing w:after="40" w:line="240" w:lineRule="auto"/>
+        <w:jc w:val="left"/>
+      </w:pPr>
+      <w:r>
+        <w:t>1.2 Aplicación práctica en el Servicio de Ahorro de la Mutual de Todos</w:t>
+      </w:r>
+      <w:r>
+        <w:tab/>
+      </w:r>
+      <w:r>
+        <w:t>Pág. 4</w:t>
+      </w:r>
+    </w:p>
+    <w:p>
+      <w:pPr>
+        <w:tabs>
+          <w:tab w:pos="8391" w:val="right" w:leader="dot"/>
+        </w:tabs>
+        <w:spacing w:after="40" w:line="240" w:lineRule="auto"/>
+        <w:jc w:val="left"/>
+      </w:pPr>
+      <w:r>
+        <w:t>2. Las mutuales en el nuevo escenario económico financiero</w:t>
+      </w:r>
+      <w:r>
+        <w:tab/>
+      </w:r>
+      <w:r>
+        <w:t>Pág. 5</w:t>
+      </w:r>
+    </w:p>
+    <w:p>
+      <w:pPr>
+        <w:tabs>
+          <w:tab w:pos="8391" w:val="right" w:leader="dot"/>
+        </w:tabs>
+        <w:spacing w:after="40" w:line="240" w:lineRule="auto"/>
+        <w:jc w:val="left"/>
+      </w:pPr>
+      <w:r>
+        <w:t>2.1 Conceptos teóricos más relevantes identificados</w:t>
+      </w:r>
+      <w:r>
+        <w:tab/>
+      </w:r>
+      <w:r>
+        <w:t>Pág. 5</w:t>
+      </w:r>
+    </w:p>
+    <w:p>
+      <w:pPr>
+        <w:tabs>
+          <w:tab w:pos="8391" w:val="right" w:leader="dot"/>
+        </w:tabs>
+        <w:spacing w:after="40" w:line="240" w:lineRule="auto"/>
+        <w:jc w:val="left"/>
+      </w:pPr>
+      <w:r>
+        <w:t>2.2 Aplicación práctica en el Servicio de Ahorro de la Mutual de Todos</w:t>
+      </w:r>
+      <w:r>
+        <w:tab/>
+      </w:r>
+      <w:r>
+        <w:t>Pág. 5</w:t>
+      </w:r>
+    </w:p>
+    <w:p>
+      <w:pPr>
+        <w:tabs>
+          <w:tab w:pos="8391" w:val="right" w:leader="dot"/>
+        </w:tabs>
+        <w:spacing w:after="40" w:line="240" w:lineRule="auto"/>
+        <w:jc w:val="left"/>
+      </w:pPr>
+      <w:r>
+        <w:t>3. Elementos normativos y jurídicos de la gestión financiera</w:t>
+      </w:r>
+      <w:r>
+        <w:tab/>
+      </w:r>
+      <w:r>
+        <w:t>Pág. 6</w:t>
+      </w:r>
+    </w:p>
+    <w:p>
+      <w:pPr>
+        <w:tabs>
+          <w:tab w:pos="8391" w:val="right" w:leader="dot"/>
+        </w:tabs>
+        <w:spacing w:after="40" w:line="240" w:lineRule="auto"/>
+        <w:jc w:val="left"/>
+      </w:pPr>
+      <w:r>
+        <w:t>3.1 Conceptos teóricos más relevantes identificados</w:t>
+      </w:r>
+      <w:r>
+        <w:tab/>
+      </w:r>
+      <w:r>
+        <w:t>Pág. 6</w:t>
+      </w:r>
+    </w:p>
+    <w:p>
+      <w:pPr>
+        <w:tabs>
+          <w:tab w:pos="8391" w:val="right" w:leader="dot"/>
+        </w:tabs>
+        <w:spacing w:after="40" w:line="240" w:lineRule="auto"/>
+        <w:jc w:val="left"/>
+      </w:pPr>
+      <w:r>
+        <w:t>3.2 Aplicación práctica en el Servicio de Ahorro de la Mutual de Todos</w:t>
+      </w:r>
+      <w:r>
+        <w:tab/>
+      </w:r>
+      <w:r>
+        <w:t>Pág. 6</w:t>
+      </w:r>
+    </w:p>
+    <w:p>
+      <w:pPr>
+        <w:tabs>
+          <w:tab w:pos="8391" w:val="right" w:leader="dot"/>
+        </w:tabs>
+        <w:spacing w:after="40" w:line="240" w:lineRule="auto"/>
+        <w:jc w:val="left"/>
+      </w:pPr>
+      <w:r>
+        <w:t>4. Plan de Negocios</w:t>
+      </w:r>
+      <w:r>
+        <w:tab/>
+      </w:r>
+      <w:r>
+        <w:t>Pág. 7</w:t>
+      </w:r>
+    </w:p>
+    <w:p>
+      <w:pPr>
+        <w:tabs>
+          <w:tab w:pos="8391" w:val="right" w:leader="dot"/>
+        </w:tabs>
+        <w:spacing w:after="40" w:line="240" w:lineRule="auto"/>
+        <w:jc w:val="left"/>
+      </w:pPr>
+      <w:r>
+        <w:t>4.1 Conceptos teóricos más relevantes identificados</w:t>
+      </w:r>
+      <w:r>
+        <w:tab/>
+      </w:r>
+      <w:r>
+        <w:t>Pág. 7</w:t>
+      </w:r>
+    </w:p>
+    <w:p>
+      <w:pPr>
+        <w:tabs>
+          <w:tab w:pos="8391" w:val="right" w:leader="dot"/>
+        </w:tabs>
+        <w:spacing w:after="40" w:line="240" w:lineRule="auto"/>
+        <w:jc w:val="left"/>
+      </w:pPr>
+      <w:r>
+        <w:t>4.2 Aplicación práctica en el Servicio de Ahorro de la Mutual de Todos</w:t>
+      </w:r>
+      <w:r>
+        <w:tab/>
+      </w:r>
+      <w:r>
+        <w:t>Pág. 7</w:t>
+      </w:r>
+    </w:p>
+    <w:p>
+      <w:pPr>
+        <w:tabs>
+          <w:tab w:pos="8391" w:val="right" w:leader="dot"/>
+        </w:tabs>
+        <w:spacing w:after="40" w:line="240" w:lineRule="auto"/>
+        <w:jc w:val="left"/>
+      </w:pPr>
+      <w:r>
+        <w:t>5. Principios de Gobierno Corporativo</w:t>
+      </w:r>
+      <w:r>
+        <w:tab/>
+      </w:r>
+      <w:r>
+        <w:t>Pág. 8</w:t>
+      </w:r>
+    </w:p>
+    <w:p>
+      <w:pPr>
+        <w:tabs>
+          <w:tab w:pos="8391" w:val="right" w:leader="dot"/>
+        </w:tabs>
+        <w:spacing w:after="40" w:line="240" w:lineRule="auto"/>
+        <w:jc w:val="left"/>
+      </w:pPr>
+      <w:r>
+        <w:t>5.1 Conceptos teóricos más relevantes identificados</w:t>
+      </w:r>
+      <w:r>
+        <w:tab/>
+      </w:r>
+      <w:r>
+        <w:t>Pág. 8</w:t>
+      </w:r>
+    </w:p>
+    <w:p>
+      <w:pPr>
+        <w:tabs>
+          <w:tab w:pos="8391" w:val="right" w:leader="dot"/>
+        </w:tabs>
+        <w:spacing w:after="40" w:line="240" w:lineRule="auto"/>
+        <w:jc w:val="left"/>
+      </w:pPr>
+      <w:r>
+        <w:t>5.2 Aplicación práctica en el Servicio de Ahorro de la Mutual de Todos</w:t>
+      </w:r>
+      <w:r>
+        <w:tab/>
+      </w:r>
+      <w:r>
+        <w:t>Pág. 8</w:t>
+      </w:r>
+    </w:p>
+    <w:p>
+      <w:pPr>
+        <w:tabs>
+          <w:tab w:pos="8391" w:val="right" w:leader="dot"/>
+        </w:tabs>
+        <w:spacing w:after="40" w:line="240" w:lineRule="auto"/>
+        <w:jc w:val="left"/>
+      </w:pPr>
+      <w:r>
+        <w:t>6. Gestión de Riesgos Corporativos</w:t>
+      </w:r>
+      <w:r>
+        <w:tab/>
+      </w:r>
+      <w:r>
+        <w:t>Pág. 9</w:t>
+      </w:r>
+    </w:p>
+    <w:p>
+      <w:pPr>
+        <w:tabs>
+          <w:tab w:pos="8391" w:val="right" w:leader="dot"/>
+        </w:tabs>
+        <w:spacing w:after="40" w:line="240" w:lineRule="auto"/>
+        <w:jc w:val="left"/>
+      </w:pPr>
+      <w:r>
+        <w:t>6.1 Conceptos teóricos más relevantes identificados</w:t>
+      </w:r>
+      <w:r>
+        <w:tab/>
+      </w:r>
+      <w:r>
+        <w:t>Pág. 9</w:t>
+      </w:r>
+    </w:p>
+    <w:p>
+      <w:pPr>
+        <w:tabs>
+          <w:tab w:pos="8391" w:val="right" w:leader="dot"/>
+        </w:tabs>
+        <w:spacing w:after="40" w:line="240" w:lineRule="auto"/>
+        <w:jc w:val="left"/>
+      </w:pPr>
+      <w:r>
+        <w:t>6.2 Aplicación práctica en el Servicio de Ahorro de la Mutual de Todos</w:t>
+      </w:r>
+      <w:r>
+        <w:tab/>
+      </w:r>
+      <w:r>
+        <w:t>Pág. 9</w:t>
+      </w:r>
+    </w:p>
+    <w:p>
+      <w:pPr>
+        <w:tabs>
+          <w:tab w:pos="8391" w:val="right" w:leader="dot"/>
+        </w:tabs>
+        <w:spacing w:after="40" w:line="240" w:lineRule="auto"/>
+        <w:jc w:val="left"/>
+      </w:pPr>
+      <w:r>
+        <w:t>7. Riesgo Operacional</w:t>
+      </w:r>
+      <w:r>
+        <w:tab/>
+      </w:r>
+      <w:r>
+        <w:t>Pág. 10</w:t>
+      </w:r>
+    </w:p>
+    <w:p>
+      <w:pPr>
+        <w:tabs>
+          <w:tab w:pos="8391" w:val="right" w:leader="dot"/>
+        </w:tabs>
+        <w:spacing w:after="40" w:line="240" w:lineRule="auto"/>
+        <w:jc w:val="left"/>
+      </w:pPr>
+      <w:r>
+        <w:t>7.1 Conceptos teóricos más relevantes identificados</w:t>
+      </w:r>
+      <w:r>
+        <w:tab/>
+      </w:r>
+      <w:r>
+        <w:t>Pág. 10</w:t>
+      </w:r>
+    </w:p>
+    <w:p>
+      <w:pPr>
+        <w:tabs>
+          <w:tab w:pos="8391" w:val="right" w:leader="dot"/>
+        </w:tabs>
+        <w:spacing w:after="40" w:line="240" w:lineRule="auto"/>
+        <w:jc w:val="left"/>
+      </w:pPr>
+      <w:r>
+        <w:t>7.2 Aplicación práctica en el Servicio de Ahorro de la Mutual de Todos</w:t>
+      </w:r>
+      <w:r>
+        <w:tab/>
+      </w:r>
+      <w:r>
+        <w:t>Pág. 10</w:t>
+      </w:r>
+    </w:p>
+    <w:p>
+      <w:pPr>
+        <w:tabs>
+          <w:tab w:pos="8391" w:val="right" w:leader="dot"/>
+        </w:tabs>
+        <w:spacing w:after="40" w:line="240" w:lineRule="auto"/>
+        <w:jc w:val="left"/>
+      </w:pPr>
+      <w:r>
+        <w:t>8. Administración de tecnologías informáticas y seguridad tecnológica</w:t>
+      </w:r>
+      <w:r>
+        <w:tab/>
+      </w:r>
+      <w:r>
+        <w:t>Pág. 11</w:t>
+      </w:r>
+    </w:p>
+    <w:p>
+      <w:pPr>
+        <w:tabs>
+          <w:tab w:pos="8391" w:val="right" w:leader="dot"/>
+        </w:tabs>
+        <w:spacing w:after="40" w:line="240" w:lineRule="auto"/>
+        <w:jc w:val="left"/>
+      </w:pPr>
+      <w:r>
+        <w:t>8.1 Conceptos teóricos más relevantes identificados</w:t>
+      </w:r>
+      <w:r>
+        <w:tab/>
+      </w:r>
+      <w:r>
+        <w:t>Pág. 11</w:t>
+      </w:r>
+    </w:p>
+    <w:p>
+      <w:pPr>
+        <w:tabs>
+          <w:tab w:pos="8391" w:val="right" w:leader="dot"/>
+        </w:tabs>
+        <w:spacing w:after="40" w:line="240" w:lineRule="auto"/>
+        <w:jc w:val="left"/>
+      </w:pPr>
+      <w:r>
+        <w:t>8.2 Aplicación práctica en el Servicio de Ahorro de la Mutual de Todos</w:t>
+      </w:r>
+      <w:r>
+        <w:tab/>
+      </w:r>
+      <w:r>
+        <w:t>Pág. 11</w:t>
+      </w:r>
+    </w:p>
+    <w:p>
+      <w:pPr>
+        <w:tabs>
+          <w:tab w:pos="8391" w:val="right" w:leader="dot"/>
+        </w:tabs>
+        <w:spacing w:after="40" w:line="240" w:lineRule="auto"/>
+        <w:jc w:val="left"/>
+      </w:pPr>
+      <w:r>
+        <w:t>9. Prevención de lavado de activos y financiamiento del terrorismo</w:t>
+      </w:r>
+      <w:r>
+        <w:tab/>
+      </w:r>
+      <w:r>
+        <w:t>Pág. 12</w:t>
+      </w:r>
+    </w:p>
+    <w:p>
+      <w:pPr>
+        <w:tabs>
+          <w:tab w:pos="8391" w:val="right" w:leader="dot"/>
+        </w:tabs>
+        <w:spacing w:after="40" w:line="240" w:lineRule="auto"/>
+        <w:jc w:val="left"/>
+      </w:pPr>
+      <w:r>
+        <w:t>9.1 Conceptos teóricos más relevantes identificados</w:t>
+      </w:r>
+      <w:r>
+        <w:tab/>
+      </w:r>
+      <w:r>
+        <w:t>Pág. 12</w:t>
+      </w:r>
+    </w:p>
+    <w:p>
+      <w:pPr>
+        <w:tabs>
+          <w:tab w:pos="8391" w:val="right" w:leader="dot"/>
+        </w:tabs>
+        <w:spacing w:after="40" w:line="240" w:lineRule="auto"/>
+        <w:jc w:val="left"/>
+      </w:pPr>
+      <w:r>
+        <w:t>9.2 Aplicación práctica en el Servicio de Ahorro de la Mutual de Todos</w:t>
+      </w:r>
+      <w:r>
+        <w:tab/>
+      </w:r>
+      <w:r>
+        <w:t>Pág. 12</w:t>
+      </w:r>
+    </w:p>
+    <w:p>
+      <w:pPr>
+        <w:tabs>
+          <w:tab w:pos="8391" w:val="right" w:leader="dot"/>
+        </w:tabs>
+        <w:spacing w:after="40" w:line="240" w:lineRule="auto"/>
+        <w:jc w:val="left"/>
+      </w:pPr>
+      <w:r>
+        <w:t>10. Control de Gestión</w:t>
+      </w:r>
+      <w:r>
+        <w:tab/>
+      </w:r>
+      <w:r>
+        <w:t>Pág. 13</w:t>
+      </w:r>
+    </w:p>
+    <w:p>
+      <w:pPr>
+        <w:tabs>
+          <w:tab w:pos="8391" w:val="right" w:leader="dot"/>
+        </w:tabs>
+        <w:spacing w:after="40" w:line="240" w:lineRule="auto"/>
+        <w:jc w:val="left"/>
+      </w:pPr>
+      <w:r>
+        <w:t>10.1 Conceptos teóricos más relevantes identificados</w:t>
+      </w:r>
+      <w:r>
+        <w:tab/>
+      </w:r>
+      <w:r>
+        <w:t>Pág. 13</w:t>
+      </w:r>
+    </w:p>
+    <w:p>
+      <w:pPr>
+        <w:tabs>
+          <w:tab w:pos="8391" w:val="right" w:leader="dot"/>
+        </w:tabs>
+        <w:spacing w:after="40" w:line="240" w:lineRule="auto"/>
+        <w:jc w:val="left"/>
+      </w:pPr>
+      <w:r>
+        <w:t>10.2 Aplicación práctica en el Servicio de Ahorro de la Mutual de Todos</w:t>
+      </w:r>
+      <w:r>
+        <w:tab/>
+      </w:r>
+      <w:r>
+        <w:t>Pág. 13</w:t>
+      </w:r>
+    </w:p>
+    <w:p>
+      <w:pPr>
+        <w:tabs>
+          <w:tab w:pos="8391" w:val="right" w:leader="dot"/>
+        </w:tabs>
+        <w:spacing w:after="40" w:line="240" w:lineRule="auto"/>
+        <w:jc w:val="left"/>
+      </w:pPr>
+      <w:r>
+        <w:t>11. Conclusión Final e Integración Institucional</w:t>
+      </w:r>
+      <w:r>
+        <w:tab/>
+      </w:r>
+      <w:r>
+        <w:t>Pág. 15</w:t>
+      </w:r>
+    </w:p>
+    <w:p>
+      <w:pPr>
+        <w:tabs>
+          <w:tab w:pos="8391" w:val="right" w:leader="dot"/>
+        </w:tabs>
+        <w:spacing w:after="40" w:line="240" w:lineRule="auto"/>
+        <w:jc w:val="left"/>
+      </w:pPr>
+      <w:r>
+        <w:t>12. Bibliografía y Fuentes Normativas</w:t>
+      </w:r>
+      <w:r>
+        <w:tab/>
+      </w:r>
+      <w:r>
+        <w:t>Pág. 16</w:t>
+      </w:r>
+    </w:p>
+    <w:p>
+      <w:r>
+        <w:br w:type="page"/>
+      </w:r>
+    </w:p>
+    <w:p>
+      <w:pPr>
         <w:spacing w:after="0" w:line="240" w:lineRule="auto"/>
       </w:pPr>
     </w:p>
     <w:p>
       <w:pPr>
-        <w:spacing w:line="276" w:lineRule="auto" w:after="160"/>
-      </w:pPr>
-      <w:r>
-        <w:t>1. Contexto internacional</w:t>
-      </w:r>
-    </w:p>
-    <w:p>
-      <w:pPr>
-        <w:spacing w:after="0" w:line="240" w:lineRule="auto"/>
-      </w:pPr>
-    </w:p>
-    <w:p>
-      <w:pPr>
-        <w:spacing w:line="276" w:lineRule="auto" w:after="160"/>
-      </w:pPr>
-      <w:r>
-        <w:t>Conceptos teóricos más relevantes identificados ................................................... Pág. 4</w:t>
-      </w:r>
-    </w:p>
-    <w:p>
-      <w:pPr>
-        <w:spacing w:after="0" w:line="240" w:lineRule="auto"/>
-      </w:pPr>
-    </w:p>
-    <w:p>
-      <w:pPr>
-        <w:spacing w:line="276" w:lineRule="auto" w:after="160"/>
-      </w:pPr>
-      <w:r>
-        <w:t>Aplicación práctica en el Servicio de Ahorro de la Mutual de Todos ....................... Pág. 4</w:t>
-      </w:r>
-    </w:p>
-    <w:p>
-      <w:pPr>
-        <w:spacing w:after="0" w:line="240" w:lineRule="auto"/>
-      </w:pPr>
-    </w:p>
-    <w:p>
-      <w:pPr>
-        <w:spacing w:line="276" w:lineRule="auto" w:after="160"/>
-      </w:pPr>
-      <w:r>
-        <w:t>2. Las mutuales en el nuevo escenario económico financiero</w:t>
-      </w:r>
-    </w:p>
-    <w:p>
-      <w:pPr>
-        <w:spacing w:after="0" w:line="240" w:lineRule="auto"/>
-      </w:pPr>
-    </w:p>
-    <w:p>
-      <w:pPr>
-        <w:spacing w:line="276" w:lineRule="auto" w:after="160"/>
-      </w:pPr>
-      <w:r>
-        <w:t>Conceptos teóricos más relevantes identificados ................................................... Pág. 5</w:t>
-      </w:r>
-    </w:p>
-    <w:p>
-      <w:pPr>
-        <w:spacing w:after="0" w:line="240" w:lineRule="auto"/>
-      </w:pPr>
-    </w:p>
-    <w:p>
-      <w:pPr>
-        <w:spacing w:line="276" w:lineRule="auto" w:after="160"/>
-      </w:pPr>
-      <w:r>
-        <w:t>Aplicación práctica en el Servicio de Ahorro de la Mutual de Todos ....................... Pág. 5</w:t>
-      </w:r>
-    </w:p>
-    <w:p>
-      <w:pPr>
-        <w:spacing w:after="0" w:line="240" w:lineRule="auto"/>
-      </w:pPr>
-    </w:p>
-    <w:p>
-      <w:pPr>
-        <w:spacing w:line="276" w:lineRule="auto" w:after="160"/>
-      </w:pPr>
-      <w:r>
-        <w:t>3. Elementos normativos y jurídicos de la gestión financiera</w:t>
-      </w:r>
-    </w:p>
-    <w:p>
-      <w:pPr>
-        <w:spacing w:after="0" w:line="240" w:lineRule="auto"/>
-      </w:pPr>
-    </w:p>
-    <w:p>
-      <w:pPr>
-        <w:spacing w:line="276" w:lineRule="auto" w:after="160"/>
-      </w:pPr>
-      <w:r>
-        <w:t>Conceptos teóricos más relevantes identificados ................................................... Pág. 6</w:t>
-      </w:r>
-    </w:p>
-    <w:p>
-      <w:pPr>
-        <w:spacing w:after="0" w:line="240" w:lineRule="auto"/>
-      </w:pPr>
-    </w:p>
-    <w:p>
-      <w:pPr>
-        <w:spacing w:line="276" w:lineRule="auto" w:after="160"/>
-      </w:pPr>
-      <w:r>
-        <w:t>Aplicación práctica en el Servicio de Ahorro de la Mutual de Todos ....................... Pág. 6</w:t>
-      </w:r>
-    </w:p>
-    <w:p>
-      <w:pPr>
-        <w:spacing w:after="0" w:line="240" w:lineRule="auto"/>
-      </w:pPr>
-    </w:p>
-    <w:p>
-      <w:pPr>
-        <w:spacing w:line="276" w:lineRule="auto" w:after="160"/>
-      </w:pPr>
-      <w:r>
-        <w:t>4. Plan de Negocios</w:t>
-      </w:r>
-    </w:p>
-    <w:p>
-      <w:pPr>
-        <w:spacing w:after="0" w:line="240" w:lineRule="auto"/>
-      </w:pPr>
-    </w:p>
-    <w:p>
-      <w:pPr>
-        <w:spacing w:line="276" w:lineRule="auto" w:after="160"/>
-      </w:pPr>
-      <w:r>
-        <w:t>Conceptos teóricos más relevantes identificados ................................................... Pág. 7</w:t>
-      </w:r>
-    </w:p>
-    <w:p>
-      <w:pPr>
-        <w:spacing w:after="0" w:line="240" w:lineRule="auto"/>
-      </w:pPr>
-    </w:p>
-    <w:p>
-      <w:pPr>
-        <w:spacing w:line="276" w:lineRule="auto" w:after="160"/>
-      </w:pPr>
-      <w:r>
-        <w:t>Aplicación práctica en el Servicio de Ahorro de la Mutual de Todos ....................... Pág. 7</w:t>
-      </w:r>
-    </w:p>
-    <w:p>
-      <w:pPr>
-        <w:spacing w:after="0" w:line="240" w:lineRule="auto"/>
-      </w:pPr>
-    </w:p>
-    <w:p>
-      <w:pPr>
-        <w:spacing w:line="276" w:lineRule="auto" w:after="160"/>
-      </w:pPr>
-      <w:r>
-        <w:t>5. Principios de Gobierno Corporativo</w:t>
-      </w:r>
-    </w:p>
-    <w:p>
-      <w:pPr>
-        <w:spacing w:after="0" w:line="240" w:lineRule="auto"/>
-      </w:pPr>
-    </w:p>
-    <w:p>
-      <w:pPr>
-        <w:spacing w:line="276" w:lineRule="auto" w:after="160"/>
-      </w:pPr>
-      <w:r>
-        <w:t>Conceptos teóricos más relevantes identificados ................................................... Pág. 8</w:t>
-      </w:r>
-    </w:p>
-    <w:p>
-      <w:pPr>
-        <w:spacing w:after="0" w:line="240" w:lineRule="auto"/>
-      </w:pPr>
-    </w:p>
-    <w:p>
-      <w:pPr>
-        <w:spacing w:line="276" w:lineRule="auto" w:after="160"/>
-      </w:pPr>
-      <w:r>
-        <w:t>Aplicación práctica en el Servicio de Ahorro de la Mutual de Todos ....................... Pág. 8</w:t>
-      </w:r>
-    </w:p>
-    <w:p>
-      <w:pPr>
-        <w:spacing w:after="0" w:line="240" w:lineRule="auto"/>
-      </w:pPr>
-    </w:p>
-    <w:p>
-      <w:pPr>
-        <w:spacing w:line="276" w:lineRule="auto" w:after="160"/>
-      </w:pPr>
-      <w:r>
-        <w:t>6. Gestión de Riesgos Corporativos</w:t>
-      </w:r>
-    </w:p>
-    <w:p>
-      <w:pPr>
-        <w:spacing w:after="0" w:line="240" w:lineRule="auto"/>
-      </w:pPr>
-    </w:p>
-    <w:p>
-      <w:pPr>
-        <w:spacing w:line="276" w:lineRule="auto" w:after="160"/>
-      </w:pPr>
-      <w:r>
-        <w:t>Conceptos teóricos más relevantes identificados ................................................... Pág. 9</w:t>
-      </w:r>
-    </w:p>
-    <w:p>
-      <w:pPr>
-        <w:spacing w:after="0" w:line="240" w:lineRule="auto"/>
-      </w:pPr>
-    </w:p>
-    <w:p>
-      <w:pPr>
-        <w:spacing w:line="276" w:lineRule="auto" w:after="160"/>
-      </w:pPr>
-      <w:r>
-        <w:t>Aplicación práctica en el Servicio de Ahorro de la Mutual de Todos ....................... Pág. 9</w:t>
-      </w:r>
-    </w:p>
-    <w:p>
-      <w:pPr>
-        <w:spacing w:after="0" w:line="240" w:lineRule="auto"/>
-      </w:pPr>
-    </w:p>
-    <w:p>
-      <w:pPr>
-        <w:spacing w:line="276" w:lineRule="auto" w:after="160"/>
-      </w:pPr>
-      <w:r>
-        <w:t>7. Riesgo Operacional</w:t>
-      </w:r>
-    </w:p>
-    <w:p>
-      <w:pPr>
-        <w:spacing w:after="0" w:line="240" w:lineRule="auto"/>
-      </w:pPr>
-    </w:p>
-    <w:p>
-      <w:pPr>
-        <w:spacing w:line="276" w:lineRule="auto" w:after="160"/>
-      </w:pPr>
-      <w:r>
-        <w:t>Conceptos teóricos más relevantes identificados ................................................. Pág. 10</w:t>
-      </w:r>
-    </w:p>
-    <w:p>
-      <w:pPr>
-        <w:spacing w:after="0" w:line="240" w:lineRule="auto"/>
-      </w:pPr>
-    </w:p>
-    <w:p>
-      <w:pPr>
-        <w:spacing w:line="276" w:lineRule="auto" w:after="160"/>
-      </w:pPr>
-      <w:r>
-        <w:t>Aplicación práctica en el Servicio de Ahorro de la Mutual de Todos ...................... Pág. 10</w:t>
-      </w:r>
-    </w:p>
-    <w:p>
-      <w:pPr>
-        <w:spacing w:after="0" w:line="240" w:lineRule="auto"/>
-      </w:pPr>
-    </w:p>
-    <w:p>
-      <w:pPr>
-        <w:spacing w:line="276" w:lineRule="auto" w:after="160"/>
-      </w:pPr>
-      <w:r>
-        <w:t>8. Administración de tecnologías informáticas y seguridad tecnológica</w:t>
-      </w:r>
-    </w:p>
-    <w:p>
-      <w:pPr>
-        <w:spacing w:after="0" w:line="240" w:lineRule="auto"/>
-      </w:pPr>
-    </w:p>
-    <w:p>
-      <w:pPr>
-        <w:spacing w:line="276" w:lineRule="auto" w:after="160"/>
-      </w:pPr>
-      <w:r>
-        <w:t>Conceptos teóricos más relevantes identificados ................................................. Pág. 11</w:t>
-      </w:r>
-    </w:p>
-    <w:p>
-      <w:pPr>
-        <w:spacing w:after="0" w:line="240" w:lineRule="auto"/>
-      </w:pPr>
-    </w:p>
-    <w:p>
-      <w:pPr>
-        <w:spacing w:line="276" w:lineRule="auto" w:after="160"/>
-      </w:pPr>
-      <w:r>
-        <w:t>Aplicación práctica en el Servicio de Ahorro de la Mutual de Todos ...................... Pág. 11</w:t>
-      </w:r>
-    </w:p>
-    <w:p>
-      <w:pPr>
-        <w:spacing w:after="0" w:line="240" w:lineRule="auto"/>
-      </w:pPr>
-    </w:p>
-    <w:p>
-      <w:pPr>
-        <w:spacing w:line="276" w:lineRule="auto" w:after="160"/>
-      </w:pPr>
-      <w:r>
-        <w:t>9. Prevención de lavado de activos y financiamiento del terrorismo</w:t>
-      </w:r>
-    </w:p>
-    <w:p>
-      <w:pPr>
-        <w:spacing w:after="0" w:line="240" w:lineRule="auto"/>
-      </w:pPr>
-    </w:p>
-    <w:p>
-      <w:pPr>
-        <w:spacing w:line="276" w:lineRule="auto" w:after="160"/>
-      </w:pPr>
-      <w:r>
-        <w:t>Conceptos teóricos más relevantes identificados ................................................. Pág. 12</w:t>
-      </w:r>
-    </w:p>
-    <w:p>
-      <w:pPr>
-        <w:spacing w:after="0" w:line="240" w:lineRule="auto"/>
-      </w:pPr>
-    </w:p>
-    <w:p>
-      <w:pPr>
-        <w:spacing w:line="276" w:lineRule="auto" w:after="160"/>
-      </w:pPr>
-      <w:r>
-        <w:t>Aplicación práctica en el Servicio de Ahorro de la Mutual de Todos ...................... Pág. 12</w:t>
-      </w:r>
-    </w:p>
-    <w:p>
-      <w:pPr>
-        <w:spacing w:after="0" w:line="240" w:lineRule="auto"/>
-      </w:pPr>
-    </w:p>
-    <w:p>
-      <w:pPr>
-        <w:spacing w:line="276" w:lineRule="auto" w:after="160"/>
-      </w:pPr>
-      <w:r>
-        <w:t>10. Control de Gestión</w:t>
-      </w:r>
-    </w:p>
-    <w:p>
-      <w:pPr>
-        <w:spacing w:after="0" w:line="240" w:lineRule="auto"/>
-      </w:pPr>
-    </w:p>
-    <w:p>
-      <w:pPr>
-        <w:spacing w:line="276" w:lineRule="auto" w:after="160"/>
-      </w:pPr>
-      <w:r>
-        <w:t>Conceptos teóricos más relevantes identificados ................................................. Pág. 13</w:t>
-      </w:r>
-    </w:p>
-    <w:p>
-      <w:pPr>
-        <w:spacing w:after="0" w:line="240" w:lineRule="auto"/>
-      </w:pPr>
-    </w:p>
-    <w:p>
-      <w:pPr>
-        <w:spacing w:line="276" w:lineRule="auto" w:after="160"/>
-      </w:pPr>
-      <w:r>
-        <w:t>Aplicación práctica en el Servicio de Ahorro de la Mutual de Todos ...................... Pág. 13</w:t>
-      </w:r>
-    </w:p>
-    <w:p>
-      <w:pPr>
-        <w:spacing w:after="0" w:line="240" w:lineRule="auto"/>
-      </w:pPr>
-    </w:p>
-    <w:p>
-      <w:pPr>
-        <w:spacing w:line="276" w:lineRule="auto" w:after="160"/>
-      </w:pPr>
-      <w:r>
-        <w:t>Conclusión Final e Integración Institucional ....................................................... Pág. 15</w:t>
-      </w:r>
-    </w:p>
-    <w:p>
-      <w:pPr>
-        <w:spacing w:after="0" w:line="240" w:lineRule="auto"/>
-      </w:pPr>
-    </w:p>
-    <w:p>
-      <w:pPr>
-        <w:spacing w:line="276" w:lineRule="auto" w:after="160"/>
-      </w:pPr>
-      <w:r>
-        <w:t>Bibliografía y Fuentes Normativas ........................................................................ Pág. 16</w:t>
-      </w:r>
-    </w:p>
-    <w:p>
-      <w:pPr>
-        <w:spacing w:after="0" w:line="240" w:lineRule="auto"/>
-      </w:pPr>
-    </w:p>
-    <w:p>
-      <w:r>
-        <w:br w:type="page"/>
-      </w:r>
-    </w:p>
-    <w:p>
-      <w:pPr>
-        <w:spacing w:after="0" w:line="240" w:lineRule="auto"/>
-      </w:pPr>
-    </w:p>
-    <w:p>
-      <w:pPr>
-        <w:spacing w:line="276" w:lineRule="auto" w:after="160"/>
+        <w:pStyle w:val="Heading1"/>
         <w:jc w:val="both"/>
       </w:pPr>
       <w:r>
@@ -714,7 +854,6 @@
     </w:p>
     <w:p>
       <w:pPr>
-        <w:spacing w:line="276" w:lineRule="auto" w:after="160"/>
         <w:jc w:val="both"/>
       </w:pPr>
       <w:r>
@@ -737,7 +876,6 @@
     </w:p>
     <w:p>
       <w:pPr>
-        <w:spacing w:line="276" w:lineRule="auto" w:after="160"/>
         <w:jc w:val="both"/>
       </w:pPr>
       <w:r>
@@ -796,7 +934,6 @@
     </w:p>
     <w:p>
       <w:pPr>
-        <w:spacing w:line="276" w:lineRule="auto" w:after="160"/>
         <w:jc w:val="both"/>
       </w:pPr>
       <w:r>
@@ -810,7 +947,7 @@
     </w:p>
     <w:p>
       <w:pPr>
-        <w:spacing w:line="276" w:lineRule="auto" w:after="160"/>
+        <w:pStyle w:val="Heading1"/>
         <w:jc w:val="both"/>
       </w:pPr>
       <w:r>
@@ -827,7 +964,7 @@
     </w:p>
     <w:p>
       <w:pPr>
-        <w:spacing w:line="276" w:lineRule="auto" w:after="160"/>
+        <w:pStyle w:val="Heading2"/>
         <w:jc w:val="both"/>
       </w:pPr>
       <w:r>
@@ -844,7 +981,6 @@
     </w:p>
     <w:p>
       <w:pPr>
-        <w:spacing w:line="276" w:lineRule="auto" w:after="160"/>
         <w:jc w:val="both"/>
       </w:pPr>
       <w:r>
@@ -858,7 +994,6 @@
     </w:p>
     <w:p>
       <w:pPr>
-        <w:spacing w:line="276" w:lineRule="auto" w:after="160"/>
         <w:jc w:val="both"/>
       </w:pPr>
       <w:r>
@@ -872,7 +1007,7 @@
     </w:p>
     <w:p>
       <w:pPr>
-        <w:spacing w:line="276" w:lineRule="auto" w:after="160"/>
+        <w:pStyle w:val="Heading2"/>
         <w:jc w:val="both"/>
       </w:pPr>
       <w:r>
@@ -889,7 +1024,6 @@
     </w:p>
     <w:p>
       <w:pPr>
-        <w:spacing w:line="276" w:lineRule="auto" w:after="160"/>
         <w:jc w:val="both"/>
       </w:pPr>
       <w:r>
@@ -912,7 +1046,6 @@
     </w:p>
     <w:p>
       <w:pPr>
-        <w:spacing w:line="276" w:lineRule="auto" w:after="160"/>
         <w:jc w:val="both"/>
       </w:pPr>
       <w:r>
@@ -932,7 +1065,6 @@
     </w:p>
     <w:p>
       <w:pPr>
-        <w:spacing w:line="276" w:lineRule="auto" w:after="160"/>
         <w:jc w:val="both"/>
       </w:pPr>
       <w:r>
@@ -952,7 +1084,6 @@
     </w:p>
     <w:p>
       <w:pPr>
-        <w:spacing w:line="276" w:lineRule="auto" w:after="160"/>
         <w:jc w:val="both"/>
       </w:pPr>
       <w:r>
@@ -972,7 +1103,7 @@
     </w:p>
     <w:p>
       <w:pPr>
-        <w:spacing w:line="276" w:lineRule="auto" w:after="160"/>
+        <w:pStyle w:val="Heading1"/>
         <w:jc w:val="both"/>
       </w:pPr>
       <w:r>
@@ -989,7 +1120,7 @@
     </w:p>
     <w:p>
       <w:pPr>
-        <w:spacing w:line="276" w:lineRule="auto" w:after="160"/>
+        <w:pStyle w:val="Heading2"/>
         <w:jc w:val="both"/>
       </w:pPr>
       <w:r>
@@ -1006,7 +1137,6 @@
     </w:p>
     <w:p>
       <w:pPr>
-        <w:spacing w:line="276" w:lineRule="auto" w:after="160"/>
         <w:jc w:val="both"/>
       </w:pPr>
       <w:r>
@@ -1020,7 +1150,6 @@
     </w:p>
     <w:p>
       <w:pPr>
-        <w:spacing w:line="276" w:lineRule="auto" w:after="160"/>
         <w:jc w:val="both"/>
       </w:pPr>
       <w:r>
@@ -1043,7 +1172,7 @@
     </w:p>
     <w:p>
       <w:pPr>
-        <w:spacing w:line="276" w:lineRule="auto" w:after="160"/>
+        <w:pStyle w:val="Heading2"/>
         <w:jc w:val="both"/>
       </w:pPr>
       <w:r>
@@ -1060,7 +1189,6 @@
     </w:p>
     <w:p>
       <w:pPr>
-        <w:spacing w:line="276" w:lineRule="auto" w:after="160"/>
         <w:jc w:val="both"/>
       </w:pPr>
       <w:r>
@@ -1083,7 +1211,6 @@
     </w:p>
     <w:p>
       <w:pPr>
-        <w:spacing w:line="276" w:lineRule="auto" w:after="160"/>
         <w:jc w:val="both"/>
       </w:pPr>
       <w:r>
@@ -1103,7 +1230,6 @@
     </w:p>
     <w:p>
       <w:pPr>
-        <w:spacing w:line="276" w:lineRule="auto" w:after="160"/>
         <w:jc w:val="both"/>
       </w:pPr>
       <w:r>
@@ -1141,7 +1267,6 @@
     </w:p>
     <w:p>
       <w:pPr>
-        <w:spacing w:line="276" w:lineRule="auto" w:after="160"/>
         <w:jc w:val="both"/>
       </w:pPr>
       <w:r>
@@ -1161,7 +1286,7 @@
     </w:p>
     <w:p>
       <w:pPr>
-        <w:spacing w:line="276" w:lineRule="auto" w:after="160"/>
+        <w:pStyle w:val="Heading1"/>
         <w:jc w:val="both"/>
       </w:pPr>
       <w:r>
@@ -1178,7 +1303,7 @@
     </w:p>
     <w:p>
       <w:pPr>
-        <w:spacing w:line="276" w:lineRule="auto" w:after="160"/>
+        <w:pStyle w:val="Heading2"/>
         <w:jc w:val="both"/>
       </w:pPr>
       <w:r>
@@ -1195,7 +1320,6 @@
     </w:p>
     <w:p>
       <w:pPr>
-        <w:spacing w:line="276" w:lineRule="auto" w:after="160"/>
         <w:jc w:val="both"/>
       </w:pPr>
       <w:r>
@@ -1209,7 +1333,6 @@
     </w:p>
     <w:p>
       <w:pPr>
-        <w:spacing w:line="276" w:lineRule="auto" w:after="160"/>
         <w:jc w:val="both"/>
       </w:pPr>
       <w:r>
@@ -1223,7 +1346,7 @@
     </w:p>
     <w:p>
       <w:pPr>
-        <w:spacing w:line="276" w:lineRule="auto" w:after="160"/>
+        <w:pStyle w:val="Heading2"/>
         <w:jc w:val="both"/>
       </w:pPr>
       <w:r>
@@ -1240,7 +1363,6 @@
     </w:p>
     <w:p>
       <w:pPr>
-        <w:spacing w:line="276" w:lineRule="auto" w:after="160"/>
         <w:jc w:val="both"/>
       </w:pPr>
       <w:r>
@@ -1263,7 +1385,6 @@
     </w:p>
     <w:p>
       <w:pPr>
-        <w:spacing w:line="276" w:lineRule="auto" w:after="160"/>
         <w:jc w:val="both"/>
       </w:pPr>
       <w:r>
@@ -1283,7 +1404,6 @@
     </w:p>
     <w:p>
       <w:pPr>
-        <w:spacing w:line="276" w:lineRule="auto" w:after="160"/>
         <w:jc w:val="both"/>
       </w:pPr>
       <w:r>
@@ -1303,7 +1423,6 @@
     </w:p>
     <w:p>
       <w:pPr>
-        <w:spacing w:line="276" w:lineRule="auto" w:after="160"/>
         <w:jc w:val="both"/>
       </w:pPr>
       <w:r>
@@ -1323,7 +1442,7 @@
     </w:p>
     <w:p>
       <w:pPr>
-        <w:spacing w:line="276" w:lineRule="auto" w:after="160"/>
+        <w:pStyle w:val="Heading1"/>
         <w:jc w:val="both"/>
       </w:pPr>
       <w:r>
@@ -1340,7 +1459,7 @@
     </w:p>
     <w:p>
       <w:pPr>
-        <w:spacing w:line="276" w:lineRule="auto" w:after="160"/>
+        <w:pStyle w:val="Heading2"/>
         <w:jc w:val="both"/>
       </w:pPr>
       <w:r>
@@ -1357,7 +1476,6 @@
     </w:p>
     <w:p>
       <w:pPr>
-        <w:spacing w:line="276" w:lineRule="auto" w:after="160"/>
         <w:jc w:val="both"/>
       </w:pPr>
       <w:r>
@@ -1371,7 +1489,6 @@
     </w:p>
     <w:p>
       <w:pPr>
-        <w:spacing w:line="276" w:lineRule="auto" w:after="160"/>
         <w:jc w:val="both"/>
       </w:pPr>
       <w:r>
@@ -1385,7 +1502,7 @@
     </w:p>
     <w:p>
       <w:pPr>
-        <w:spacing w:line="276" w:lineRule="auto" w:after="160"/>
+        <w:pStyle w:val="Heading2"/>
         <w:jc w:val="both"/>
       </w:pPr>
       <w:r>
@@ -1402,7 +1519,6 @@
     </w:p>
     <w:p>
       <w:pPr>
-        <w:spacing w:line="276" w:lineRule="auto" w:after="160"/>
         <w:jc w:val="both"/>
       </w:pPr>
       <w:r>
@@ -1425,7 +1541,6 @@
     </w:p>
     <w:p>
       <w:pPr>
-        <w:spacing w:line="276" w:lineRule="auto" w:after="160"/>
         <w:jc w:val="both"/>
       </w:pPr>
       <w:r>
@@ -1463,7 +1578,6 @@
     </w:p>
     <w:p>
       <w:pPr>
-        <w:spacing w:line="276" w:lineRule="auto" w:after="160"/>
         <w:jc w:val="both"/>
       </w:pPr>
       <w:r>
@@ -1483,7 +1597,6 @@
     </w:p>
     <w:p>
       <w:pPr>
-        <w:spacing w:line="276" w:lineRule="auto" w:after="160"/>
         <w:jc w:val="both"/>
       </w:pPr>
       <w:r>
@@ -1503,7 +1616,6 @@
     </w:p>
     <w:p>
       <w:pPr>
-        <w:spacing w:line="276" w:lineRule="auto" w:after="160"/>
         <w:jc w:val="both"/>
       </w:pPr>
       <w:r>
@@ -1523,7 +1635,7 @@
     </w:p>
     <w:p>
       <w:pPr>
-        <w:spacing w:line="276" w:lineRule="auto" w:after="160"/>
+        <w:pStyle w:val="Heading1"/>
         <w:jc w:val="both"/>
       </w:pPr>
       <w:r>
@@ -1540,7 +1652,7 @@
     </w:p>
     <w:p>
       <w:pPr>
-        <w:spacing w:line="276" w:lineRule="auto" w:after="160"/>
+        <w:pStyle w:val="Heading2"/>
         <w:jc w:val="both"/>
       </w:pPr>
       <w:r>
@@ -1557,7 +1669,6 @@
     </w:p>
     <w:p>
       <w:pPr>
-        <w:spacing w:line="276" w:lineRule="auto" w:after="160"/>
         <w:jc w:val="both"/>
       </w:pPr>
       <w:r>
@@ -1571,7 +1682,6 @@
     </w:p>
     <w:p>
       <w:pPr>
-        <w:spacing w:line="276" w:lineRule="auto" w:after="160"/>
         <w:jc w:val="both"/>
       </w:pPr>
       <w:r>
@@ -1585,7 +1695,7 @@
     </w:p>
     <w:p>
       <w:pPr>
-        <w:spacing w:line="276" w:lineRule="auto" w:after="160"/>
+        <w:pStyle w:val="Heading2"/>
         <w:jc w:val="both"/>
       </w:pPr>
       <w:r>
@@ -1602,7 +1712,6 @@
     </w:p>
     <w:p>
       <w:pPr>
-        <w:spacing w:line="276" w:lineRule="auto" w:after="160"/>
         <w:jc w:val="both"/>
       </w:pPr>
       <w:r>
@@ -1616,7 +1725,6 @@
     </w:p>
     <w:p>
       <w:pPr>
-        <w:spacing w:line="276" w:lineRule="auto" w:after="160"/>
         <w:jc w:val="both"/>
       </w:pPr>
       <w:r>
@@ -1636,7 +1744,6 @@
     </w:p>
     <w:p>
       <w:pPr>
-        <w:spacing w:line="276" w:lineRule="auto" w:after="160"/>
         <w:jc w:val="both"/>
       </w:pPr>
       <w:r>
@@ -1656,7 +1763,6 @@
     </w:p>
     <w:p>
       <w:pPr>
-        <w:spacing w:line="276" w:lineRule="auto" w:after="160"/>
         <w:jc w:val="both"/>
       </w:pPr>
       <w:r>
@@ -1676,7 +1782,7 @@
     </w:p>
     <w:p>
       <w:pPr>
-        <w:spacing w:line="276" w:lineRule="auto" w:after="160"/>
+        <w:pStyle w:val="Heading1"/>
         <w:jc w:val="both"/>
       </w:pPr>
       <w:r>
@@ -1693,7 +1799,7 @@
     </w:p>
     <w:p>
       <w:pPr>
-        <w:spacing w:line="276" w:lineRule="auto" w:after="160"/>
+        <w:pStyle w:val="Heading2"/>
         <w:jc w:val="both"/>
       </w:pPr>
       <w:r>
@@ -1710,7 +1816,6 @@
     </w:p>
     <w:p>
       <w:pPr>
-        <w:spacing w:line="276" w:lineRule="auto" w:after="160"/>
         <w:jc w:val="both"/>
       </w:pPr>
       <w:r>
@@ -1724,7 +1829,6 @@
     </w:p>
     <w:p>
       <w:pPr>
-        <w:spacing w:line="276" w:lineRule="auto" w:after="160"/>
         <w:jc w:val="both"/>
       </w:pPr>
       <w:r>
@@ -1738,7 +1842,7 @@
     </w:p>
     <w:p>
       <w:pPr>
-        <w:spacing w:line="276" w:lineRule="auto" w:after="160"/>
+        <w:pStyle w:val="Heading2"/>
         <w:jc w:val="both"/>
       </w:pPr>
       <w:r>
@@ -1755,7 +1859,6 @@
     </w:p>
     <w:p>
       <w:pPr>
-        <w:spacing w:line="276" w:lineRule="auto" w:after="160"/>
         <w:jc w:val="both"/>
       </w:pPr>
       <w:r>
@@ -1778,7 +1881,6 @@
     </w:p>
     <w:p>
       <w:pPr>
-        <w:spacing w:line="276" w:lineRule="auto" w:after="160"/>
         <w:jc w:val="both"/>
       </w:pPr>
       <w:r>
@@ -1798,7 +1900,6 @@
     </w:p>
     <w:p>
       <w:pPr>
-        <w:spacing w:line="276" w:lineRule="auto" w:after="160"/>
         <w:jc w:val="both"/>
       </w:pPr>
       <w:r>
@@ -1818,7 +1919,6 @@
     </w:p>
     <w:p>
       <w:pPr>
-        <w:spacing w:line="276" w:lineRule="auto" w:after="160"/>
         <w:jc w:val="both"/>
       </w:pPr>
       <w:r>
@@ -1838,7 +1938,7 @@
     </w:p>
     <w:p>
       <w:pPr>
-        <w:spacing w:line="276" w:lineRule="auto" w:after="160"/>
+        <w:pStyle w:val="Heading1"/>
         <w:jc w:val="both"/>
       </w:pPr>
       <w:r>
@@ -1855,7 +1955,7 @@
     </w:p>
     <w:p>
       <w:pPr>
-        <w:spacing w:line="276" w:lineRule="auto" w:after="160"/>
+        <w:pStyle w:val="Heading2"/>
         <w:jc w:val="both"/>
       </w:pPr>
       <w:r>
@@ -1872,7 +1972,6 @@
     </w:p>
     <w:p>
       <w:pPr>
-        <w:spacing w:line="276" w:lineRule="auto" w:after="160"/>
         <w:jc w:val="both"/>
       </w:pPr>
       <w:r>
@@ -1886,7 +1985,6 @@
     </w:p>
     <w:p>
       <w:pPr>
-        <w:spacing w:line="276" w:lineRule="auto" w:after="160"/>
         <w:jc w:val="both"/>
       </w:pPr>
       <w:r>
@@ -1900,7 +1998,7 @@
     </w:p>
     <w:p>
       <w:pPr>
-        <w:spacing w:line="276" w:lineRule="auto" w:after="160"/>
+        <w:pStyle w:val="Heading2"/>
         <w:jc w:val="both"/>
       </w:pPr>
       <w:r>
@@ -1917,7 +2015,6 @@
     </w:p>
     <w:p>
       <w:pPr>
-        <w:spacing w:line="276" w:lineRule="auto" w:after="160"/>
         <w:jc w:val="both"/>
       </w:pPr>
       <w:r>
@@ -1940,7 +2037,6 @@
     </w:p>
     <w:p>
       <w:pPr>
-        <w:spacing w:line="276" w:lineRule="auto" w:after="160"/>
         <w:jc w:val="both"/>
       </w:pPr>
       <w:r>
@@ -1960,7 +2056,6 @@
     </w:p>
     <w:p>
       <w:pPr>
-        <w:spacing w:line="276" w:lineRule="auto" w:after="160"/>
         <w:jc w:val="both"/>
       </w:pPr>
       <w:r>
@@ -1980,7 +2075,6 @@
     </w:p>
     <w:p>
       <w:pPr>
-        <w:spacing w:line="276" w:lineRule="auto" w:after="160"/>
         <w:jc w:val="both"/>
       </w:pPr>
       <w:r>
@@ -2000,7 +2094,6 @@
     </w:p>
     <w:p>
       <w:pPr>
-        <w:spacing w:line="276" w:lineRule="auto" w:after="160"/>
         <w:jc w:val="both"/>
       </w:pPr>
       <w:r>
@@ -2020,7 +2113,7 @@
     </w:p>
     <w:p>
       <w:pPr>
-        <w:spacing w:line="276" w:lineRule="auto" w:after="160"/>
+        <w:pStyle w:val="Heading1"/>
         <w:jc w:val="both"/>
       </w:pPr>
       <w:r>
@@ -2037,7 +2130,7 @@
     </w:p>
     <w:p>
       <w:pPr>
-        <w:spacing w:line="276" w:lineRule="auto" w:after="160"/>
+        <w:pStyle w:val="Heading2"/>
         <w:jc w:val="both"/>
       </w:pPr>
       <w:r>
@@ -2054,7 +2147,6 @@
     </w:p>
     <w:p>
       <w:pPr>
-        <w:spacing w:line="276" w:lineRule="auto" w:after="160"/>
         <w:jc w:val="both"/>
       </w:pPr>
       <w:r>
@@ -2068,7 +2160,6 @@
     </w:p>
     <w:p>
       <w:pPr>
-        <w:spacing w:line="276" w:lineRule="auto" w:after="160"/>
         <w:jc w:val="both"/>
       </w:pPr>
       <w:r>
@@ -2082,7 +2173,7 @@
     </w:p>
     <w:p>
       <w:pPr>
-        <w:spacing w:line="276" w:lineRule="auto" w:after="160"/>
+        <w:pStyle w:val="Heading2"/>
         <w:jc w:val="both"/>
       </w:pPr>
       <w:r>
@@ -2099,7 +2190,6 @@
     </w:p>
     <w:p>
       <w:pPr>
-        <w:spacing w:line="276" w:lineRule="auto" w:after="160"/>
         <w:jc w:val="both"/>
       </w:pPr>
       <w:r>
@@ -2122,7 +2212,6 @@
     </w:p>
     <w:p>
       <w:pPr>
-        <w:spacing w:line="276" w:lineRule="auto" w:after="160"/>
         <w:jc w:val="both"/>
       </w:pPr>
       <w:r>
@@ -2142,7 +2231,6 @@
     </w:p>
     <w:p>
       <w:pPr>
-        <w:spacing w:line="276" w:lineRule="auto" w:after="160"/>
         <w:jc w:val="both"/>
       </w:pPr>
       <w:r>
@@ -2162,7 +2250,6 @@
     </w:p>
     <w:p>
       <w:pPr>
-        <w:spacing w:line="276" w:lineRule="auto" w:after="160"/>
         <w:jc w:val="both"/>
       </w:pPr>
       <w:r>
@@ -2182,7 +2269,6 @@
     </w:p>
     <w:p>
       <w:pPr>
-        <w:spacing w:line="276" w:lineRule="auto" w:after="160"/>
         <w:jc w:val="both"/>
       </w:pPr>
       <w:r>
@@ -2202,7 +2288,7 @@
     </w:p>
     <w:p>
       <w:pPr>
-        <w:spacing w:line="276" w:lineRule="auto" w:after="160"/>
+        <w:pStyle w:val="Heading1"/>
         <w:jc w:val="both"/>
       </w:pPr>
       <w:r>
@@ -2219,7 +2305,7 @@
     </w:p>
     <w:p>
       <w:pPr>
-        <w:spacing w:line="276" w:lineRule="auto" w:after="160"/>
+        <w:pStyle w:val="Heading2"/>
         <w:jc w:val="both"/>
       </w:pPr>
       <w:r>
@@ -2236,7 +2322,6 @@
     </w:p>
     <w:p>
       <w:pPr>
-        <w:spacing w:line="276" w:lineRule="auto" w:after="160"/>
         <w:jc w:val="both"/>
       </w:pPr>
       <w:r>
@@ -2250,7 +2335,6 @@
     </w:p>
     <w:p>
       <w:pPr>
-        <w:spacing w:line="276" w:lineRule="auto" w:after="160"/>
         <w:jc w:val="both"/>
       </w:pPr>
       <w:r>
@@ -2264,7 +2348,7 @@
     </w:p>
     <w:p>
       <w:pPr>
-        <w:spacing w:line="276" w:lineRule="auto" w:after="160"/>
+        <w:pStyle w:val="Heading2"/>
         <w:jc w:val="both"/>
       </w:pPr>
       <w:r>
@@ -2281,7 +2365,6 @@
     </w:p>
     <w:p>
       <w:pPr>
-        <w:spacing w:line="276" w:lineRule="auto" w:after="160"/>
         <w:jc w:val="both"/>
       </w:pPr>
       <w:r>
@@ -2304,7 +2387,6 @@
     </w:p>
     <w:p>
       <w:pPr>
-        <w:spacing w:line="276" w:lineRule="auto" w:after="160"/>
         <w:jc w:val="both"/>
       </w:pPr>
       <w:r>
@@ -2324,7 +2406,6 @@
     </w:p>
     <w:p>
       <w:pPr>
-        <w:spacing w:line="276" w:lineRule="auto" w:after="160"/>
         <w:jc w:val="both"/>
       </w:pPr>
       <w:r>
@@ -2344,7 +2425,6 @@
     </w:p>
     <w:p>
       <w:pPr>
-        <w:spacing w:line="276" w:lineRule="auto" w:after="160"/>
         <w:jc w:val="both"/>
       </w:pPr>
       <w:r>
@@ -2364,7 +2444,6 @@
     </w:p>
     <w:p>
       <w:pPr>
-        <w:spacing w:line="276" w:lineRule="auto" w:after="160"/>
         <w:jc w:val="both"/>
       </w:pPr>
       <w:r>
@@ -2384,7 +2463,7 @@
     </w:p>
     <w:p>
       <w:pPr>
-        <w:spacing w:line="276" w:lineRule="auto" w:after="160"/>
+        <w:pStyle w:val="Heading1"/>
         <w:jc w:val="both"/>
       </w:pPr>
       <w:r>
@@ -2401,7 +2480,7 @@
     </w:p>
     <w:p>
       <w:pPr>
-        <w:spacing w:line="276" w:lineRule="auto" w:after="160"/>
+        <w:pStyle w:val="Heading2"/>
         <w:jc w:val="both"/>
       </w:pPr>
       <w:r>
@@ -2418,7 +2497,6 @@
     </w:p>
     <w:p>
       <w:pPr>
-        <w:spacing w:line="276" w:lineRule="auto" w:after="160"/>
         <w:jc w:val="both"/>
       </w:pPr>
       <w:r>
@@ -2432,7 +2510,6 @@
     </w:p>
     <w:p>
       <w:pPr>
-        <w:spacing w:line="276" w:lineRule="auto" w:after="160"/>
         <w:jc w:val="both"/>
       </w:pPr>
       <w:r>
@@ -2446,7 +2523,7 @@
     </w:p>
     <w:p>
       <w:pPr>
-        <w:spacing w:line="276" w:lineRule="auto" w:after="160"/>
+        <w:pStyle w:val="Heading2"/>
         <w:jc w:val="both"/>
       </w:pPr>
       <w:r>
@@ -2463,7 +2540,6 @@
     </w:p>
     <w:p>
       <w:pPr>
-        <w:spacing w:line="276" w:lineRule="auto" w:after="160"/>
         <w:jc w:val="both"/>
       </w:pPr>
       <w:r>
@@ -2486,7 +2562,6 @@
     </w:p>
     <w:p>
       <w:pPr>
-        <w:spacing w:line="276" w:lineRule="auto" w:after="160"/>
         <w:jc w:val="both"/>
       </w:pPr>
       <w:r>
@@ -2506,7 +2581,6 @@
     </w:p>
     <w:p>
       <w:pPr>
-        <w:spacing w:line="276" w:lineRule="auto" w:after="160"/>
         <w:jc w:val="both"/>
       </w:pPr>
       <w:r>
@@ -2526,7 +2600,6 @@
     </w:p>
     <w:p>
       <w:pPr>
-        <w:spacing w:line="276" w:lineRule="auto" w:after="160"/>
         <w:jc w:val="both"/>
       </w:pPr>
       <w:r>
@@ -2546,7 +2619,6 @@
     </w:p>
     <w:p>
       <w:pPr>
-        <w:spacing w:line="276" w:lineRule="auto" w:after="160"/>
         <w:jc w:val="both"/>
       </w:pPr>
       <w:r>
@@ -2566,7 +2638,6 @@
     </w:p>
     <w:p>
       <w:pPr>
-        <w:spacing w:line="276" w:lineRule="auto" w:after="160"/>
         <w:jc w:val="both"/>
       </w:pPr>
       <w:r>
@@ -2586,7 +2657,6 @@
     </w:p>
     <w:p>
       <w:pPr>
-        <w:spacing w:line="276" w:lineRule="auto" w:after="160"/>
         <w:jc w:val="both"/>
       </w:pPr>
       <w:r>
@@ -2606,7 +2676,7 @@
     </w:p>
     <w:p>
       <w:pPr>
-        <w:spacing w:line="276" w:lineRule="auto" w:after="160"/>
+        <w:pStyle w:val="Heading1"/>
         <w:jc w:val="both"/>
       </w:pPr>
       <w:r>
@@ -2623,7 +2693,6 @@
     </w:p>
     <w:p>
       <w:pPr>
-        <w:spacing w:line="276" w:lineRule="auto" w:after="160"/>
         <w:jc w:val="both"/>
       </w:pPr>
       <w:r>
@@ -2637,7 +2706,6 @@
     </w:p>
     <w:p>
       <w:pPr>
-        <w:spacing w:line="276" w:lineRule="auto" w:after="160"/>
         <w:jc w:val="both"/>
       </w:pPr>
       <w:r>
@@ -2651,7 +2719,6 @@
     </w:p>
     <w:p>
       <w:pPr>
-        <w:spacing w:line="276" w:lineRule="auto" w:after="160"/>
         <w:jc w:val="both"/>
       </w:pPr>
       <w:r>
@@ -2665,7 +2732,6 @@
     </w:p>
     <w:p>
       <w:pPr>
-        <w:spacing w:line="276" w:lineRule="auto" w:after="160"/>
         <w:jc w:val="both"/>
       </w:pPr>
       <w:r>
@@ -2679,7 +2745,7 @@
     </w:p>
     <w:p>
       <w:pPr>
-        <w:spacing w:line="276" w:lineRule="auto" w:after="160"/>
+        <w:pStyle w:val="Heading1"/>
         <w:jc w:val="both"/>
       </w:pPr>
       <w:r>
@@ -2696,7 +2762,6 @@
     </w:p>
     <w:p>
       <w:pPr>
-        <w:spacing w:line="276" w:lineRule="auto" w:after="160"/>
         <w:jc w:val="both"/>
       </w:pPr>
       <w:r>
@@ -2710,7 +2775,6 @@
     </w:p>
     <w:p>
       <w:pPr>
-        <w:spacing w:line="276" w:lineRule="auto" w:after="160"/>
         <w:jc w:val="both"/>
       </w:pPr>
       <w:r>
@@ -2724,7 +2788,6 @@
     </w:p>
     <w:p>
       <w:pPr>
-        <w:spacing w:line="276" w:lineRule="auto" w:after="160"/>
         <w:jc w:val="both"/>
       </w:pPr>
       <w:r>
@@ -2738,7 +2801,6 @@
     </w:p>
     <w:p>
       <w:pPr>
-        <w:spacing w:line="276" w:lineRule="auto" w:after="160"/>
         <w:jc w:val="both"/>
       </w:pPr>
       <w:r>
@@ -2752,7 +2814,6 @@
     </w:p>
     <w:p>
       <w:pPr>
-        <w:spacing w:line="276" w:lineRule="auto" w:after="160"/>
         <w:jc w:val="both"/>
       </w:pPr>
       <w:r>
@@ -2766,7 +2827,6 @@
     </w:p>
     <w:p>
       <w:pPr>
-        <w:spacing w:line="276" w:lineRule="auto" w:after="160"/>
         <w:jc w:val="both"/>
       </w:pPr>
       <w:r>
@@ -2780,7 +2840,6 @@
     </w:p>
     <w:p>
       <w:pPr>
-        <w:spacing w:line="276" w:lineRule="auto" w:after="160"/>
         <w:jc w:val="both"/>
       </w:pPr>
       <w:r>
@@ -2794,7 +2853,6 @@
     </w:p>
     <w:p>
       <w:pPr>
-        <w:spacing w:line="276" w:lineRule="auto" w:after="160"/>
         <w:jc w:val="both"/>
       </w:pPr>
       <w:r>
@@ -2808,7 +2866,6 @@
     </w:p>
     <w:p>
       <w:pPr>
-        <w:spacing w:line="276" w:lineRule="auto" w:after="160"/>
         <w:jc w:val="both"/>
       </w:pPr>
       <w:r>
@@ -2822,7 +2879,6 @@
     </w:p>
     <w:p>
       <w:pPr>
-        <w:spacing w:line="276" w:lineRule="auto" w:after="160"/>
         <w:jc w:val="both"/>
       </w:pPr>
       <w:r>
@@ -2836,7 +2892,6 @@
     </w:p>
     <w:p>
       <w:pPr>
-        <w:spacing w:line="276" w:lineRule="auto" w:after="160"/>
         <w:jc w:val="both"/>
       </w:pPr>
       <w:r>
@@ -2850,7 +2905,6 @@
     </w:p>
     <w:p>
       <w:pPr>
-        <w:spacing w:line="276" w:lineRule="auto" w:after="160"/>
         <w:jc w:val="both"/>
       </w:pPr>
       <w:r>
@@ -3293,15 +3347,15 @@
     <w:pPr>
       <w:keepNext/>
       <w:keepLines/>
-      <w:spacing w:before="480" w:after="0"/>
+      <w:spacing w:before="0" w:after="160" w:line="276" w:lineRule="auto"/>
       <w:outlineLvl w:val="0"/>
     </w:pPr>
     <w:rPr>
-      <w:rFonts w:asciiTheme="majorHAnsi" w:eastAsiaTheme="majorEastAsia" w:hAnsiTheme="majorHAnsi" w:cstheme="majorBidi"/>
+      <w:rFonts w:asciiTheme="majorHAnsi" w:eastAsiaTheme="majorEastAsia" w:hAnsiTheme="majorHAnsi" w:cstheme="majorBidi" w:ascii="Arial" w:hAnsi="Arial" w:cs="Arial"/>
       <w:b/>
       <w:bCs/>
       <w:color w:val="365F91" w:themeColor="accent1" w:themeShade="BF"/>
-      <w:sz w:val="28"/>
+      <w:sz w:val="24"/>
       <w:szCs w:val="28"/>
     </w:rPr>
   </w:style>
@@ -3317,15 +3371,15 @@
     <w:pPr>
       <w:keepNext/>
       <w:keepLines/>
-      <w:spacing w:before="200" w:after="0"/>
+      <w:spacing w:before="0" w:after="160" w:line="276" w:lineRule="auto"/>
       <w:outlineLvl w:val="1"/>
     </w:pPr>
     <w:rPr>
-      <w:rFonts w:asciiTheme="majorHAnsi" w:eastAsiaTheme="majorEastAsia" w:hAnsiTheme="majorHAnsi" w:cstheme="majorBidi"/>
+      <w:rFonts w:asciiTheme="majorHAnsi" w:eastAsiaTheme="majorEastAsia" w:hAnsiTheme="majorHAnsi" w:cstheme="majorBidi" w:ascii="Arial" w:hAnsi="Arial" w:cs="Arial"/>
       <w:b/>
       <w:bCs/>
       <w:color w:val="4F81BD" w:themeColor="accent1"/>
-      <w:sz w:val="26"/>
+      <w:sz w:val="24"/>
       <w:szCs w:val="26"/>
     </w:rPr>
   </w:style>

</xml_diff>